<commit_message>
Fact-check avant-propos §1-11 (22 corrections + 5 footnotes maj + 2 footnotes ajoutées). Journal complet pour reprise nouvelle session.
</commit_message>
<xml_diff>
--- a/Livre/docx/Capitalisons.docx
+++ b/Livre/docx/Capitalisons.docx
@@ -116,7 +116,7 @@
         <w:pStyle w:val="BodyText"/>
       </w:pPr>
       <w:r>
-        <w:t xml:space="preserve">Personne. Aucun investisseur français n’avait à cette date la capacité de mettre dix milliards d’euros sur la table pour un actif de cette taille. Et d’ailleurs personne ne l’a fait. Le plus gros gestionnaire français de capital-investissement, Ardian, gérait alors environ 170 milliards de dollars au total — avec des centaines d’entreprises en portefeuille direct</w:t>
+        <w:t xml:space="preserve">Personne. Aucun investisseur français n’avait à cette date la capacité de mettre dix milliards d’euros sur la table pour un actif de cette taille. Et d’ailleurs personne ne l’a fait. Le plus gros gestionnaire français de capital-investissement, Ardian, gérait alors environ 176 milliards de dollars au total — avec des centaines d’entreprises en portefeuille direct</w:t>
       </w:r>
       <w:r>
         <w:rPr>
@@ -151,7 +151,7 @@
         <w:t xml:space="preserve">CalPERS</w:t>
       </w:r>
       <w:r>
-        <w:t xml:space="preserve">, le régime des fonctionnaires de Californie et premier fonds public du pays avec environ cinq cents milliards de dollars d’actifs, s’est engagé comme</w:t>
+        <w:t xml:space="preserve">, le régime des fonctionnaires de Californie et premier fonds public du pays avec plus de cinq cents milliards de dollars d’actifs, s’est engagé comme</w:t>
       </w:r>
       <w:r>
         <w:t xml:space="preserve"> </w:t>
@@ -189,7 +189,7 @@
         <w:t xml:space="preserve">in fine</w:t>
       </w:r>
       <w:r>
-        <w:t xml:space="preserve">, les retraites des enseignants et des fonctionnaires californiens qui rachètent une part du Doliprane.</w:t>
+        <w:t xml:space="preserve">, les retraites des fonctionnaires californiens qui rachètent une part du Doliprane.</w:t>
       </w:r>
     </w:p>
     <w:p>
@@ -231,7 +231,7 @@
         <w:pStyle w:val="BodyText"/>
       </w:pPr>
       <w:r>
-        <w:t xml:space="preserve">Dans le même temps, nous détestons que des fonds de pension étrangers rachètent nos entreprises. Quand Heico, l’américain, s’empare d’Exxelia pour 453 millions d’euros, nous nous indignons</w:t>
+        <w:t xml:space="preserve">Dans le même temps, nous détestons que des capitaux étrangers rachètent nos entreprises. Quand Heico, l’américain, s’empare d’Exxelia pour 453 millions d’euros, nous nous indignons</w:t>
       </w:r>
       <w:r>
         <w:rPr>
@@ -240,7 +240,7 @@
         <w:footnoteReference w:id="17"/>
       </w:r>
       <w:r>
-        <w:t xml:space="preserve">. Quand Photonis - la pépite française des systèmes de vision nocturne pour les forces spéciales - manque d’être vendu à l’américain Teledyne, Bercy intervient en catastrophe pour orchestrer un rachat patrimonial</w:t>
+        <w:t xml:space="preserve">. Quand Photonis - la pépite française des systèmes de vision nocturne pour les forces spéciales - manque d’être vendu à l’américain Teledyne, Bercy intervient en catastrophe et la cible est finalement reprise par un consortium français adossé à Bpifrance</w:t>
       </w:r>
       <w:r>
         <w:rPr>
@@ -258,15 +258,15 @@
         <w:footnoteReference w:id="19"/>
       </w:r>
       <w:r>
-        <w:t xml:space="preserve">. Quand Lafarge passe à Holcim, Alstom Énergie à General Electric, Technip à FMC, Doliprane à Clayton, Dubilier &amp; Rice, nous pleurons dans les chaumières.</w:t>
-      </w:r>
-    </w:p>
-    <w:p>
-      <w:pPr>
-        <w:pStyle w:val="BodyText"/>
-      </w:pPr>
-      <w:r>
-        <w:t xml:space="preserve">Nous voulons donc deux choses incompatibles. Nous voulons que nos entreprises restent françaises - leurs sièges, leurs brevets, leurs centres de décision. Et nous voulons interdire qu’existe en France l’instrument qui, dans tous les pays qui s’en sont dotés, permet précisément de garder le capital national sous contrôle national. Nous voulons le résultat sans accepter l’outil. Nous reprochons aux fonds étrangers de faire ce que nous nous interdisons de faire.</w:t>
+        <w:t xml:space="preserve">. Quand Lafarge fusionne avec Holcim, Alstom Énergie passe à General Electric, Technip s’unit à FMC, Doliprane bascule à Clayton, Dubilier &amp; Rice, nous pleurons dans les chaumières.</w:t>
+      </w:r>
+    </w:p>
+    <w:p>
+      <w:pPr>
+        <w:pStyle w:val="BodyText"/>
+      </w:pPr>
+      <w:r>
+        <w:t xml:space="preserve">Nous voulons donc deux choses incompatibles. Nous voulons que nos entreprises restent françaises - leurs sièges, leurs brevets, leurs centres de décision. Et nous voulons interdire qu’existe en France l’instrument qui, dans tous les pays qui s’en sont dotés, fait précisément contrepoids aux capitaux étrangers. Nous voulons le résultat sans accepter l’outil. Nous reprochons aux fonds étrangers de faire ce que nous nous interdisons de faire.</w:t>
       </w:r>
     </w:p>
     <w:p>
@@ -308,7 +308,7 @@
         <w:pStyle w:val="BodyText"/>
       </w:pPr>
       <w:r>
-        <w:t xml:space="preserve">Il existe, dans le monde occidental, deux grandes familles de pays. Ceux qui ont des fonds de pension, et ceux qui n’en ont pas. La France est, presque seule parmi les pays comparables, dans la deuxième catégorie. Les Norvégiens dépassent 280 % une fois inclus leur fonds souverain de retraite (GPFG). La Suisse atteint 165 % de son produit intérieur brut, le Canada 158 %, les Pays-Bas 150 %, les États-Unis 147 %, l'Australie 135 %, la Suède 115 %. Les Britanniques tournent autour de 78 %. La France, elle, plafonne à 13%</w:t>
+        <w:t xml:space="preserve">Il existe, dans le monde occidental, deux grandes familles de pays. Ceux qui ont des fonds de pension, et ceux qui n’en ont pas. La France appartient, avec l’Italie et l’Allemagne, à la deuxième catégorie — un trio singulier parmi les grandes économies développées. Les Norvégiens dépassent 280 % une fois inclus leur fonds souverain de retraite (GPFG). La Suisse atteint 165 % de son produit intérieur brut, le Canada 158 %, les Pays-Bas 150 %, les États-Unis 147 %, l'Australie 135 %, la Suède 115 %. Les Britanniques tournent autour de 78 %. La France, elle, plafonne à 13 % — à peu près au même niveau que l’Italie (12 %) et l’Allemagne (6 %)</w:t>
       </w:r>
       <w:r>
         <w:rPr>
@@ -16355,7 +16355,7 @@
         <w:t xml:space="preserve">Annual Report 2024</w:t>
       </w:r>
       <w:r>
-        <w:t xml:space="preserve">, 2025. À fin 2024, Ardian gérait plus de 170 milliards de dollars d’actifs. À titre de comparaison, le seul fonds de pension néerlandais ABP — qui gère les retraites des fonctionnaires des Pays-Bas — administrait environ 552 milliards d'euros à la même date, soit près de trois fois l'encours d'Ardian. Voir Stichting Pensioenfonds ABP, Jaarverslag 2024, 2025 (https://www.abp.nl/over-abp/jaarverslag).</w:t>
+        <w:t xml:space="preserve">, 2025. À fin 2024, Ardian gérait environ 176 milliards de dollars d’actifs. À titre de comparaison, le seul fonds de pension néerlandais ABP — qui gère les retraites des fonctionnaires des Pays-Bas — administrait environ 533 milliards d’euros au 30 septembre 2024, soit près de trois fois l'encours d'Ardian. Voir Stichting Pensioenfonds ABP, Jaarverslag 2024, 2025 (https://www.abp.nl/over-abp/jaarverslag).</w:t>
       </w:r>
     </w:p>
   </w:footnote>
@@ -16463,7 +16463,7 @@
         <w:t xml:space="preserve"> </w:t>
       </w:r>
       <w:r>
-        <w:t xml:space="preserve">Loi n° 97-277 du 25 mars 1997, dite « loi Thomas », créant les plans d’épargne retraite (https://www.legifrance.gouv.fr/jorf/id/JORFTEXT000000198906). La loi a été votée sous le gouvernement Juppé et promulguée. Le gouvernement Jospin, après les législatives de juin 1997, a refusé de publier les décrets d’application, rendant la loi inapplicable. Elle a été formellement abrogée en 2002. Pour un historique détaillé : Charles Descours, Rapport sur la proposition de loi épargne retraite (fonds de pension), Sénat, commission des affaires sociales, rapport n° 8 (1999-2000), 7 octobre 1999 (https://www.senat.fr/rap/l99-008/l99-0085.html).</w:t>
+        <w:t xml:space="preserve">Loi n° 97-277 du 25 mars 1997, dite « loi Thomas », créant les plans d’épargne retraite (https://www.legifrance.gouv.fr/jorf/id/JORFTEXT000000198906). La loi a été votée sous le gouvernement Juppé et promulguée. Le gouvernement Jospin, après les législatives de juin 1997, a refusé de publier les décrets d’application, rendant la loi inapplicable. Elle a été formellement abrogée par l’article 11 de la loi n° 2002-73 du 17 janvier 2002 de modernisation sociale. Pour un historique détaillé : Charles Descours, Rapport sur la proposition de loi épargne retraite (fonds de pension), Sénat, commission des affaires sociales, rapport n° 8 (1999-2000), 7 octobre 1999 (https://www.senat.fr/rap/l99-008/l99-0085.html).</w:t>
       </w:r>
     </w:p>
   </w:footnote>
@@ -16524,7 +16524,7 @@
           <w:i/>
           <w:iCs/>
         </w:rPr>
-        <w:t xml:space="preserve">Usine Nouvelle, La production du moteur d'Ariane 6 transférée de la France à l'Allemagne, 2021 (https://www.usinenouvelle.com/article/la-production-du-moteur-d-ariane-6-transferee-de-la-france-a-l-allemagne.N1143627). Le transfert concerne l'intégration et les essais de réception du moteur Vinci (étage supérieur), du site ArianeGroup de Vernon vers le centre DLR de Lampoldshausen. Annoncé en 2021, confirmé par accord politique le 24 octobre 2025. Le développement et les turbopompes à oxygène liquide (Vinci et Vulcain 2.1) restent à Vernon.</w:t>
+        <w:t xml:space="preserve">Usine Nouvelle, La production du moteur d'Ariane 6 transférée de la France à l'Allemagne, 2021 (https://www.usinenouvelle.com/article/la-production-du-moteur-d-ariane-6-transferee-de-la-france-a-l-allemagne.N1143627). Le transfert concerne l'intégration et les essais de réception du moteur Vinci (étage supérieur), du site ArianeGroup de Vernon vers le centre DLR de Lampoldshausen. Premières évocations dans la presse en 2021 ; confirmation officielle par communiqué conjoint ArianeGroup-DLR le 24 octobre 2025 (jusqu’à 12 moteurs Vinci par an assemblés et testés à Lampoldshausen, livrés à Brême pour intégration sur Ariane 6). Le développement et les turbopompes à oxygène liquide (Vinci et Vulcain 2.1) restent à Vernon.</w:t>
       </w:r>
     </w:p>
   </w:footnote>

</xml_diff>